<commit_message>
feat:  ✨ improved reporto and updated formatting and language in project notebook
</commit_message>
<xml_diff>
--- a/Relazione_CTG.docx
+++ b/Relazione_CTG.docx
@@ -62,22 +62,41 @@
       <w:r>
         <w:rPr>
           <w:rFonts w:eastAsia="Arial" w:cs="Arial"/>
+          <w:sz w:val="24"/>
+          <w:szCs w:val="24"/>
+        </w:rPr>
+      </w:r>
+    </w:p>
+    <w:p>
+      <w:pPr>
+        <w:pStyle w:val="Normal"/>
+        <w:spacing w:before="0" w:after="100"/>
+        <w:jc w:val="start"/>
+        <w:rPr>
+          <w:rFonts w:eastAsia="Arial" w:cs="Arial"/>
+          <w:sz w:val="24"/>
+          <w:szCs w:val="24"/>
+        </w:rPr>
+      </w:pPr>
+      <w:r>
+        <w:rPr>
+          <w:rFonts w:eastAsia="Arial" w:cs="Arial"/>
+          <w:sz w:val="24"/>
+          <w:szCs w:val="24"/>
+        </w:rPr>
+      </w:r>
+    </w:p>
+    <w:p>
+      <w:pPr>
+        <w:pStyle w:val="Normal"/>
+        <w:spacing w:before="0" w:after="100"/>
+        <w:jc w:val="start"/>
+        <w:rPr>
+          <w:rFonts w:eastAsia="Arial" w:cs="Arial"/>
           <w:color w:val="000000"/>
           <w:sz w:val="24"/>
           <w:szCs w:val="24"/>
         </w:rPr>
-      </w:r>
-    </w:p>
-    <w:p>
-      <w:pPr>
-        <w:pStyle w:val="Normal"/>
-        <w:spacing w:before="0" w:after="100"/>
-        <w:jc w:val="start"/>
-        <w:rPr>
-          <w:rFonts w:eastAsia="Arial" w:cs="Arial"/>
-          <w:sz w:val="24"/>
-          <w:szCs w:val="24"/>
-        </w:rPr>
       </w:pPr>
       <w:r>
         <w:rPr>
@@ -86,38 +105,9 @@
           <w:sz w:val="24"/>
           <w:szCs w:val="24"/>
         </w:rPr>
-      </w:r>
-    </w:p>
-    <w:p>
-      <w:pPr>
-        <w:pStyle w:val="Normal"/>
-        <w:spacing w:before="0" w:after="100"/>
-        <w:jc w:val="start"/>
-        <w:rPr>
-          <w:rFonts w:eastAsia="Arial" w:cs="Arial"/>
-          <w:color w:val="000000"/>
-          <w:sz w:val="24"/>
-          <w:szCs w:val="24"/>
-        </w:rPr>
-      </w:pPr>
-      <w:r>
-        <w:rPr>
-          <w:rFonts w:eastAsia="Arial" w:cs="Arial"/>
-          <w:color w:val="000000"/>
-          <w:sz w:val="24"/>
-          <w:szCs w:val="24"/>
-        </w:rPr>
         <w:br/>
         <w:br/>
         <w:br/>
-      </w:r>
-      <w:r>
-        <w:rPr>
-          <w:rFonts w:eastAsia="Arial" w:cs="Arial"/>
-          <w:color w:val="000000"/>
-          <w:sz w:val="24"/>
-          <w:szCs w:val="24"/>
-        </w:rPr>
         <w:t>Studente: Claudio Scamporlino</w:t>
       </w:r>
     </w:p>
@@ -306,221 +296,41 @@
           <w:sz w:val="22"/>
           <w:szCs w:val="22"/>
         </w:rPr>
-        <w:t>I</w:t>
-      </w:r>
-      <w:r>
-        <w:rPr>
-          <w:rFonts w:eastAsia="Arial" w:cs="Arial"/>
-          <w:sz w:val="22"/>
-          <w:szCs w:val="22"/>
-        </w:rPr>
-        <w:t xml:space="preserve">l </w:t>
-      </w:r>
-      <w:r>
-        <w:rPr>
-          <w:rFonts w:eastAsia="Arial" w:cs="Arial"/>
-          <w:sz w:val="22"/>
-          <w:szCs w:val="22"/>
-        </w:rPr>
-        <w:t xml:space="preserve">progetto </w:t>
-      </w:r>
-      <w:r>
-        <w:rPr>
-          <w:rFonts w:eastAsia="Arial" w:cs="Arial"/>
-          <w:sz w:val="22"/>
-          <w:szCs w:val="22"/>
-        </w:rPr>
-        <w:t>c</w:t>
-      </w:r>
-      <w:r>
-        <w:rPr>
-          <w:rFonts w:eastAsia="Arial" w:cs="Arial"/>
-          <w:sz w:val="22"/>
-          <w:szCs w:val="22"/>
-        </w:rPr>
-        <w:t>onsiste in un esperimento di classificazione in Python. H</w:t>
-      </w:r>
-      <w:r>
-        <w:rPr>
-          <w:rFonts w:eastAsia="Arial" w:cs="Arial"/>
-          <w:sz w:val="22"/>
-          <w:szCs w:val="22"/>
-        </w:rPr>
-        <w:t xml:space="preserve">o scelto </w:t>
-      </w:r>
-      <w:r>
-        <w:rPr>
-          <w:rFonts w:eastAsia="Arial" w:cs="Arial"/>
-          <w:sz w:val="22"/>
-          <w:szCs w:val="22"/>
-        </w:rPr>
-        <w:t>d</w:t>
-      </w:r>
-      <w:r>
-        <w:rPr>
-          <w:rFonts w:eastAsia="Arial" w:cs="Arial"/>
-          <w:sz w:val="22"/>
-          <w:szCs w:val="22"/>
-        </w:rPr>
-        <w:t xml:space="preserve">i occuparmi di </w:t>
-      </w:r>
-      <w:r>
-        <w:rPr>
-          <w:rFonts w:eastAsia="Arial" w:cs="Arial"/>
-          <w:sz w:val="22"/>
-          <w:szCs w:val="22"/>
-        </w:rPr>
-        <w:t>un dataset medico che contiene misurazioni estratte da cardiotocogrammi fetali, cioè quei tracciati che si fanno in gravidanza per monitorare il battito del feto e le contrazioni uterine.</w:t>
-      </w:r>
-    </w:p>
-    <w:p>
-      <w:pPr>
-        <w:pStyle w:val="Normal"/>
-        <w:spacing w:lineRule="auto" w:line="319" w:before="0" w:after="160"/>
-        <w:rPr/>
-      </w:pPr>
-      <w:r>
-        <w:rPr>
-          <w:rFonts w:eastAsia="Arial" w:cs="Arial"/>
-          <w:sz w:val="22"/>
-          <w:szCs w:val="22"/>
-        </w:rPr>
-        <w:t xml:space="preserve">Ho scelto questo dataset per diversi motivi. Innanzitutto ha 2.126 campioni e 21 feature numeriche, una dimensione che si presta bene sia agli algoritmi classici sia al deep learning. </w:t>
-      </w:r>
-      <w:r>
-        <w:rPr>
-          <w:rFonts w:eastAsia="Arial" w:cs="Arial"/>
-          <w:sz w:val="22"/>
-          <w:szCs w:val="22"/>
-        </w:rPr>
-        <w:t>I</w:t>
-      </w:r>
-      <w:r>
-        <w:rPr>
-          <w:rFonts w:eastAsia="Arial" w:cs="Arial"/>
-          <w:sz w:val="22"/>
-          <w:szCs w:val="22"/>
-        </w:rPr>
-        <w:t xml:space="preserve">l fatto di avere </w:t>
-      </w:r>
-      <w:r>
-        <w:rPr>
-          <w:rFonts w:eastAsia="Arial" w:cs="Arial"/>
-          <w:sz w:val="22"/>
-          <w:szCs w:val="22"/>
-        </w:rPr>
-        <w:t xml:space="preserve">3 classi (normal, suspect, pathologic) lo rende più interessante di un semplice binario. Infine, trattandosi di medicina, la spiegabilità diventa </w:t>
-      </w:r>
-      <w:r>
-        <w:rPr>
-          <w:rFonts w:eastAsia="Arial" w:cs="Arial"/>
-          <w:sz w:val="22"/>
-          <w:szCs w:val="22"/>
-        </w:rPr>
-        <w:t>particolarmente importante</w:t>
-      </w:r>
-      <w:r>
-        <w:rPr>
-          <w:rFonts w:eastAsia="Arial" w:cs="Arial"/>
-          <w:sz w:val="22"/>
-          <w:szCs w:val="22"/>
-        </w:rPr>
-        <w:t>: aiuta a capire quali variabili pesano di più nelle decisioni del modello.</w:t>
-      </w:r>
-    </w:p>
-    <w:p>
-      <w:pPr>
-        <w:pStyle w:val="Normal"/>
-        <w:spacing w:lineRule="auto" w:line="319" w:before="0" w:after="160"/>
-        <w:rPr/>
-      </w:pPr>
-      <w:r>
-        <w:rPr>
-          <w:rFonts w:eastAsia="Arial" w:cs="Arial"/>
-          <w:sz w:val="22"/>
-          <w:szCs w:val="22"/>
-        </w:rPr>
-        <w:t>O</w:t>
-      </w:r>
-      <w:r>
-        <w:rPr>
-          <w:rFonts w:eastAsia="Arial" w:cs="Arial"/>
-          <w:sz w:val="22"/>
-          <w:szCs w:val="22"/>
-        </w:rPr>
-        <w:t xml:space="preserve">ltre ad </w:t>
-      </w:r>
-      <w:r>
-        <w:rPr>
-          <w:rFonts w:eastAsia="Arial" w:cs="Arial"/>
-          <w:sz w:val="22"/>
-          <w:szCs w:val="22"/>
-        </w:rPr>
-        <w:t xml:space="preserve">analisi PCA, tre classificatori, metriche di valutazione </w:t>
-      </w:r>
-      <w:r>
-        <w:rPr>
-          <w:rFonts w:eastAsia="Arial" w:cs="Arial"/>
-          <w:sz w:val="22"/>
-          <w:szCs w:val="22"/>
-        </w:rPr>
-        <w:t>e</w:t>
-      </w:r>
-      <w:r>
-        <w:rPr>
-          <w:rFonts w:eastAsia="Arial" w:cs="Arial"/>
-          <w:sz w:val="22"/>
-          <w:szCs w:val="22"/>
-        </w:rPr>
-        <w:t xml:space="preserve"> visualizzazioni, </w:t>
-      </w:r>
-      <w:r>
-        <w:rPr>
-          <w:rFonts w:eastAsia="Arial" w:cs="Arial"/>
-          <w:sz w:val="22"/>
-          <w:szCs w:val="22"/>
-        </w:rPr>
-        <w:t>h</w:t>
-      </w:r>
-      <w:r>
-        <w:rPr>
-          <w:rFonts w:eastAsia="Arial" w:cs="Arial"/>
-          <w:sz w:val="22"/>
-          <w:szCs w:val="22"/>
-        </w:rPr>
-        <w:t>o scelto di implementare sia l’</w:t>
-      </w:r>
-      <w:r>
-        <w:rPr>
-          <w:rFonts w:eastAsia="Arial" w:cs="Arial"/>
-          <w:sz w:val="22"/>
-          <w:szCs w:val="22"/>
-        </w:rPr>
-        <w:t xml:space="preserve">approccio deep learning, </w:t>
-      </w:r>
-      <w:r>
-        <w:rPr>
-          <w:rFonts w:eastAsia="Arial" w:cs="Arial"/>
-          <w:sz w:val="22"/>
-          <w:szCs w:val="22"/>
-        </w:rPr>
-        <w:t>s</w:t>
-      </w:r>
-      <w:r>
-        <w:rPr>
-          <w:rFonts w:eastAsia="Arial" w:cs="Arial"/>
-          <w:sz w:val="22"/>
-          <w:szCs w:val="22"/>
-        </w:rPr>
-        <w:t>ia</w:t>
-      </w:r>
-      <w:r>
-        <w:rPr>
-          <w:rFonts w:eastAsia="Arial" w:cs="Arial"/>
-          <w:sz w:val="22"/>
-          <w:szCs w:val="22"/>
-        </w:rPr>
-        <w:t xml:space="preserve"> l'analisi di spiegabilità con SHAP.</w:t>
+        <w:t>Il progetto consiste in un esperimento di classificazione in Python. Ho scelto di occuparmi di un dataset medico che contiene misurazioni estratte da cardiotocogrammi fetali, cioè quei tracciati che si fanno in gravidanza per monitorare il battito del feto e le contrazioni uterine.</w:t>
+      </w:r>
+    </w:p>
+    <w:p>
+      <w:pPr>
+        <w:pStyle w:val="Normal"/>
+        <w:spacing w:lineRule="auto" w:line="319" w:before="0" w:after="160"/>
+        <w:rPr/>
+      </w:pPr>
+      <w:r>
+        <w:rPr>
+          <w:rFonts w:eastAsia="Arial" w:cs="Arial"/>
+          <w:sz w:val="22"/>
+          <w:szCs w:val="22"/>
+        </w:rPr>
+        <w:t>Ho scelto questo dataset per diversi motivi. Innanzitutto ha 2.126 campioni e 21 feature numeriche, una dimensione che si presta bene sia agli algoritmi classici sia al deep learning. Il fatto di avere 3 classi (normal, suspect, pathologic) lo rende più interessante di un semplice binario. Infine, trattandosi di medicina, la spiegabilità diventa particolarmente importante: aiuta a capire quali variabili pesano di più nelle decisioni del modello.</w:t>
+      </w:r>
+    </w:p>
+    <w:p>
+      <w:pPr>
+        <w:pStyle w:val="Normal"/>
+        <w:spacing w:lineRule="auto" w:line="319" w:before="0" w:after="160"/>
+        <w:rPr>
+          <w:rFonts w:eastAsia="Arial" w:cs="Arial"/>
+          <w:sz w:val="22"/>
+          <w:szCs w:val="22"/>
+        </w:rPr>
+      </w:pPr>
+      <w:r>
+        <w:rPr>
+          <w:rFonts w:eastAsia="Arial" w:cs="Arial"/>
+          <w:sz w:val="22"/>
+          <w:szCs w:val="22"/>
+        </w:rPr>
+        <w:t>Oltre alla PCA, ai tre classificatori, alle metriche di valutazione e alle visualizzazioni, ho scelto di includere sia l’approccio deep learning sia l’analisi di spiegabilità con SHAP.</w:t>
         <w:br/>
         <w:br/>
       </w:r>
@@ -862,14 +672,8 @@
           <w:szCs w:val="22"/>
         </w:rPr>
         <w:t xml:space="preserve"> L'ho usata come baseline lineare. Nonostante la sua semplicità, funziona discretamente perché la PCA ha già “raddrizzato” i dati lungo le direzioni di massima varianza.</w:t>
-      </w:r>
-    </w:p>
-    <w:p>
-      <w:pPr>
-        <w:pStyle w:val="Normal"/>
-        <w:spacing w:lineRule="auto" w:line="319" w:before="0" w:after="160"/>
-        <w:rPr/>
-      </w:pPr>
+        <w:br/>
+      </w:r>
       <w:r>
         <w:rPr>
           <w:rFonts w:eastAsia="Arial" w:cs="Arial"/>
@@ -887,14 +691,8 @@
           <w:szCs w:val="22"/>
         </w:rPr>
         <w:t xml:space="preserve"> Ho scelto il kernel RBF perché introduce non-linearità e permette al modello di tracciare confini decisionali curvi. Ho impostato probability=True per poter calcolare le probabilità e poter valutare il modello tramite la curva ROC AUC, che in ambito clinico è essenziale per capire quanto il sistema sia affidabile.</w:t>
-      </w:r>
-    </w:p>
-    <w:p>
-      <w:pPr>
-        <w:pStyle w:val="Normal"/>
-        <w:spacing w:lineRule="auto" w:line="319" w:before="0" w:after="160"/>
-        <w:rPr/>
-      </w:pPr>
+        <w:br/>
+      </w:r>
       <w:r>
         <w:rPr>
           <w:rFonts w:eastAsia="Arial" w:cs="Arial"/>
@@ -926,8 +724,6 @@
           <w:sz w:val="22"/>
           <w:szCs w:val="22"/>
         </w:rPr>
-        <w:t>Tutti e tre sono stati addestrati sulle feature ridotte con PCA.</w:t>
-        <w:br/>
         <w:br/>
       </w:r>
       <w:r>
@@ -974,8 +770,8 @@
         <w:gridCol w:w="2500"/>
         <w:gridCol w:w="1372"/>
         <w:gridCol w:w="1372"/>
-        <w:gridCol w:w="1369"/>
-        <w:gridCol w:w="1372"/>
+        <w:gridCol w:w="1367"/>
+        <w:gridCol w:w="1374"/>
         <w:gridCol w:w="1375"/>
       </w:tblGrid>
       <w:tr>
@@ -1072,7 +868,7 @@
         </w:tc>
         <w:tc>
           <w:tcPr>
-            <w:tcW w:w="1369" w:type="dxa"/>
+            <w:tcW w:w="1367" w:type="dxa"/>
             <w:tcBorders>
               <w:top w:val="single" w:sz="2" w:space="0" w:color="CCCCCC"/>
               <w:start w:val="single" w:sz="2" w:space="0" w:color="CCCCCC"/>
@@ -1102,7 +898,7 @@
         </w:tc>
         <w:tc>
           <w:tcPr>
-            <w:tcW w:w="1372" w:type="dxa"/>
+            <w:tcW w:w="1374" w:type="dxa"/>
             <w:tcBorders>
               <w:top w:val="single" w:sz="2" w:space="0" w:color="CCCCCC"/>
               <w:start w:val="single" w:sz="2" w:space="0" w:color="CCCCCC"/>
@@ -1249,7 +1045,7 @@
         </w:tc>
         <w:tc>
           <w:tcPr>
-            <w:tcW w:w="1369" w:type="dxa"/>
+            <w:tcW w:w="1367" w:type="dxa"/>
             <w:tcBorders>
               <w:top w:val="single" w:sz="2" w:space="0" w:color="CCCCCC"/>
               <w:start w:val="single" w:sz="2" w:space="0" w:color="CCCCCC"/>
@@ -1277,7 +1073,7 @@
         </w:tc>
         <w:tc>
           <w:tcPr>
-            <w:tcW w:w="1372" w:type="dxa"/>
+            <w:tcW w:w="1374" w:type="dxa"/>
             <w:tcBorders>
               <w:top w:val="single" w:sz="2" w:space="0" w:color="CCCCCC"/>
               <w:start w:val="single" w:sz="2" w:space="0" w:color="CCCCCC"/>
@@ -1420,7 +1216,7 @@
         </w:tc>
         <w:tc>
           <w:tcPr>
-            <w:tcW w:w="1369" w:type="dxa"/>
+            <w:tcW w:w="1367" w:type="dxa"/>
             <w:tcBorders>
               <w:top w:val="single" w:sz="2" w:space="0" w:color="CCCCCC"/>
               <w:start w:val="single" w:sz="2" w:space="0" w:color="CCCCCC"/>
@@ -1448,7 +1244,7 @@
         </w:tc>
         <w:tc>
           <w:tcPr>
-            <w:tcW w:w="1372" w:type="dxa"/>
+            <w:tcW w:w="1374" w:type="dxa"/>
             <w:tcBorders>
               <w:top w:val="single" w:sz="2" w:space="0" w:color="CCCCCC"/>
               <w:start w:val="single" w:sz="2" w:space="0" w:color="CCCCCC"/>
@@ -1594,7 +1390,7 @@
         </w:tc>
         <w:tc>
           <w:tcPr>
-            <w:tcW w:w="1369" w:type="dxa"/>
+            <w:tcW w:w="1367" w:type="dxa"/>
             <w:tcBorders>
               <w:top w:val="single" w:sz="2" w:space="0" w:color="CCCCCC"/>
               <w:start w:val="single" w:sz="2" w:space="0" w:color="CCCCCC"/>
@@ -1622,7 +1418,7 @@
         </w:tc>
         <w:tc>
           <w:tcPr>
-            <w:tcW w:w="1372" w:type="dxa"/>
+            <w:tcW w:w="1374" w:type="dxa"/>
             <w:tcBorders>
               <w:top w:val="single" w:sz="2" w:space="0" w:color="CCCCCC"/>
               <w:start w:val="single" w:sz="2" w:space="0" w:color="CCCCCC"/>
@@ -1765,7 +1561,7 @@
         </w:tc>
         <w:tc>
           <w:tcPr>
-            <w:tcW w:w="1369" w:type="dxa"/>
+            <w:tcW w:w="1367" w:type="dxa"/>
             <w:tcBorders>
               <w:top w:val="single" w:sz="2" w:space="0" w:color="CCCCCC"/>
               <w:start w:val="single" w:sz="2" w:space="0" w:color="CCCCCC"/>
@@ -1793,7 +1589,7 @@
         </w:tc>
         <w:tc>
           <w:tcPr>
-            <w:tcW w:w="1372" w:type="dxa"/>
+            <w:tcW w:w="1374" w:type="dxa"/>
             <w:tcBorders>
               <w:top w:val="single" w:sz="2" w:space="0" w:color="CCCCCC"/>
               <w:start w:val="single" w:sz="2" w:space="0" w:color="CCCCCC"/>
@@ -1852,42 +1648,17 @@
     <w:p>
       <w:pPr>
         <w:pStyle w:val="Normal"/>
-        <w:spacing w:before="0" w:after="240"/>
-        <w:jc w:val="center"/>
-        <w:rPr>
-          <w:rFonts w:eastAsia="Arial" w:cs="Arial"/>
-          <w:i/>
-          <w:i/>
-          <w:iCs/>
-          <w:color w:val="7F8C8D"/>
-          <w:sz w:val="18"/>
-          <w:szCs w:val="18"/>
-        </w:rPr>
-      </w:pPr>
-      <w:r>
-        <w:rPr>
-          <w:rFonts w:eastAsia="Arial" w:cs="Arial"/>
-          <w:i/>
-          <w:iCs/>
-          <w:color w:val="7F8C8D"/>
-          <w:sz w:val="18"/>
-          <w:szCs w:val="18"/>
-        </w:rPr>
-      </w:r>
-    </w:p>
-    <w:p>
-      <w:pPr>
-        <w:pStyle w:val="Normal"/>
-        <w:spacing w:lineRule="auto" w:line="319" w:before="0" w:after="160"/>
-        <w:rPr/>
-      </w:pPr>
-      <w:r>
-        <w:rPr>
-          <w:rFonts w:eastAsia="Arial" w:cs="Arial"/>
-          <w:sz w:val="22"/>
-          <w:szCs w:val="22"/>
-        </w:rPr>
-        <w:t>Il Random Forest è il migliore tra gli shallow su quasi tutte le metriche, DNN risulta migliore nel confronto complessivo per F1 macro. La SVM ha la precision più alta dopo RF ma un recall più basso: in pratica è più “prudente”, quando predice Pathologic di solito ha ragione, ma ne manca di più.</w:t>
+        <w:spacing w:lineRule="auto" w:line="319" w:before="0" w:after="160"/>
+        <w:rPr/>
+      </w:pPr>
+      <w:r>
+        <w:rPr>
+          <w:rFonts w:eastAsia="Arial" w:cs="Arial"/>
+          <w:sz w:val="22"/>
+          <w:szCs w:val="22"/>
+        </w:rPr>
+        <w:br/>
+        <w:t>Il Random Forest è il migliore tra i modelli shallow su quasi tutte le metriche. Il DNN mostra un lieve vantaggio numerico in F1-score e ROC AUC, ma il margine rispetto a Random Forest è ridotto e va interpretato con cautela. La SVM ha la precision più alta dopo RF ma un recall più basso: in pratica è più “prudente”, quando predice Pathologic di solito ha ragione, ma ne manca di più.</w:t>
       </w:r>
     </w:p>
     <w:p>
@@ -2133,7 +1904,7 @@
           <w:sz w:val="22"/>
           <w:szCs w:val="22"/>
         </w:rPr>
-        <w:t>Ho usato le stesse feature PCA e lo stesso split train/validation/test degli esperimenti precedenti, così il confronto è equo.</w:t>
+        <w:t>L’uso della PCA è stato mantenuto per coerenza della pipeline e finalità didattiche; non implica ottimalità per tutti i modelli, in particolare per gli ensemble ad alberi.</w:t>
       </w:r>
     </w:p>
     <w:p>
@@ -2215,7 +1986,7 @@
           <w:sz w:val="22"/>
           <w:szCs w:val="22"/>
         </w:rPr>
-        <w:t>Sul test set il modello Deep Learning raggiunge Accuracy 0.9108, F1-Score macro 0.8477 e ROC AUC 0.9729: nel confronto complessivo risulta il migliore per F1 macro e per ROC AUC rispetto agli altri modelli. Il Random Forest resta comunque molto competitivo e spesso più semplice da interpretare con le feature importance.</w:t>
+        <w:t>Sul test set il modello Deep Learning raggiunge Accuracy 0.9108, F1-Score macro 0.8477 e ROC AUC 0.9729: nel confronto sul test set risulta leggermente superiore per F1 macro e ROC AUC, ma le prestazioni restano molto vicine a quelle del Random Forest, il quale resta comunque molto competitivo e più semplice da interpretare con le feature importance.</w:t>
       </w:r>
     </w:p>
     <w:p>
@@ -2319,7 +2090,7 @@
           <w:sz w:val="22"/>
           <w:szCs w:val="22"/>
         </w:rPr>
-        <w:t>Guardando la tabella e il grafico di confronto, i quattro modelli hanno prestazioni vicine, ma non identiche. Nel confronto complessivo sul test set, il Deep Learning (DNN) risulta il migliore per F1-Score macro e per ROC AUC, mentre il Random Forest è il migliore tra i modelli shallow.</w:t>
+        <w:t>Guardando la tabella e il grafico di confronto, i quattro modelli hanno prestazioni vicine, ma non identiche. Nel confronto sul test set, Deep Learning (DNN) e Random Forest mostrano prestazioni complessivamente comparabili; il DNN ha un vantaggio numerico lieve su F1 macro e ROC AUC.</w:t>
       </w:r>
     </w:p>
     <w:p>
@@ -2525,7 +2296,11 @@
       <w:pPr>
         <w:pStyle w:val="Normal"/>
         <w:spacing w:lineRule="auto" w:line="319" w:before="0" w:after="160"/>
-        <w:rPr/>
+        <w:rPr>
+          <w:rFonts w:eastAsia="Arial" w:cs="Arial"/>
+          <w:sz w:val="22"/>
+          <w:szCs w:val="22"/>
+        </w:rPr>
       </w:pPr>
       <w:r>
         <w:rPr>
@@ -2539,22 +2314,116 @@
     <w:p>
       <w:pPr>
         <w:pStyle w:val="Normal"/>
-        <w:spacing w:lineRule="auto" w:line="319" w:before="0" w:after="160"/>
-        <w:rPr/>
-      </w:pPr>
-      <w:r>
-        <w:rPr>
-          <w:rFonts w:eastAsia="Arial" w:cs="Arial"/>
-          <w:sz w:val="22"/>
-          <w:szCs w:val="22"/>
-        </w:rPr>
-        <w:t>- La PCA conferma molta ridondanza tra le feature: da 21 feature originali a 14 componenti per il 95% di varianza, in linea con le correlazioni osservate (es. Mode/Mean/Median).</w:t>
-        <w:br/>
-        <w:t>- Nel confronto sul test set, il Deep Learning risulta il migliore per F1-Score macro (0.848) e per ROC AUC (0.973), mentre il Random Forest è il migliore tra i modelli shallow e resta molto interpretabile tramite feature importance.</w:t>
-        <w:br/>
-        <w:t>- La parte di spiegabilità è utile soprattutto se letta a due livelli: importanze RF (semplici) e SHAP (più dettagliato). Questo rende più chiaro cosa guida le predizioni.</w:t>
-        <w:br/>
-        <w:t>- Come miglioramento futuro, si potrebbero provare strategie per lo sbilanciamento delle classi (es. pesi sulle classi) e una selezione/tuning più sistematico degli iperparametri.</w:t>
+        <w:numPr>
+          <w:ilvl w:val="0"/>
+          <w:numId w:val="1"/>
+        </w:numPr>
+        <w:spacing w:lineRule="auto" w:line="319" w:before="0" w:after="160"/>
+        <w:rPr>
+          <w:rFonts w:eastAsia="Arial" w:cs="Arial"/>
+          <w:sz w:val="22"/>
+          <w:szCs w:val="22"/>
+        </w:rPr>
+      </w:pPr>
+      <w:r>
+        <w:rPr>
+          <w:rFonts w:eastAsia="Arial" w:cs="Arial"/>
+          <w:sz w:val="22"/>
+          <w:szCs w:val="22"/>
+        </w:rPr>
+        <w:t>La PCA conferma molta ridondanza tra le feature: da 21 feature originali a 14 componenti per il 95% di varianza, in linea con le correlazioni osservate (es. Mode/Mean/Median).</w:t>
+      </w:r>
+    </w:p>
+    <w:p>
+      <w:pPr>
+        <w:pStyle w:val="Normal"/>
+        <w:numPr>
+          <w:ilvl w:val="0"/>
+          <w:numId w:val="1"/>
+        </w:numPr>
+        <w:spacing w:lineRule="auto" w:line="319" w:before="0" w:after="160"/>
+        <w:rPr>
+          <w:rFonts w:eastAsia="Arial" w:cs="Arial"/>
+          <w:sz w:val="22"/>
+          <w:szCs w:val="22"/>
+        </w:rPr>
+      </w:pPr>
+      <w:r>
+        <w:rPr>
+          <w:rFonts w:eastAsia="Arial" w:cs="Arial"/>
+          <w:sz w:val="22"/>
+          <w:szCs w:val="22"/>
+        </w:rPr>
+        <w:t>Nel confronto sul test set, DNN e Random Forest ottengono risultati molto vicini: il DNN ha un lieve vantaggio in F1 macro (0.848) e ROC AUC (0.973), mentre il Random Forest resta il migliore tra gli shallow e più immediato da interpretare.</w:t>
+      </w:r>
+    </w:p>
+    <w:p>
+      <w:pPr>
+        <w:pStyle w:val="Normal"/>
+        <w:numPr>
+          <w:ilvl w:val="0"/>
+          <w:numId w:val="1"/>
+        </w:numPr>
+        <w:spacing w:lineRule="auto" w:line="319" w:before="0" w:after="160"/>
+        <w:rPr>
+          <w:rFonts w:eastAsia="Arial" w:cs="Arial"/>
+          <w:sz w:val="22"/>
+          <w:szCs w:val="22"/>
+        </w:rPr>
+      </w:pPr>
+      <w:r>
+        <w:rPr>
+          <w:rFonts w:eastAsia="Arial" w:cs="Arial"/>
+          <w:sz w:val="22"/>
+          <w:szCs w:val="22"/>
+        </w:rPr>
+        <w:t>La parte di spiegabilità è utile soprattutto se letta a due livelli: importanze RF (semplici) e SHAP (più dettagliato). Questo rende più chiaro cosa guida le predizioni.</w:t>
+      </w:r>
+    </w:p>
+    <w:p>
+      <w:pPr>
+        <w:pStyle w:val="Normal"/>
+        <w:numPr>
+          <w:ilvl w:val="0"/>
+          <w:numId w:val="1"/>
+        </w:numPr>
+        <w:spacing w:lineRule="auto" w:line="319" w:before="0" w:after="160"/>
+        <w:rPr>
+          <w:rFonts w:eastAsia="Arial" w:cs="Arial"/>
+          <w:sz w:val="22"/>
+          <w:szCs w:val="22"/>
+        </w:rPr>
+      </w:pPr>
+      <w:r>
+        <w:rPr>
+          <w:rFonts w:eastAsia="Arial" w:cs="Arial"/>
+          <w:sz w:val="22"/>
+          <w:szCs w:val="22"/>
+        </w:rPr>
+        <w:t>Tra i miglioramenti futuri prioritari: gestione esplicita dello sbilanciamento (es. class_weight), validazione più robusta (cross-validation) e tuning sistematico degli iperparametri.</w:t>
+      </w:r>
+    </w:p>
+    <w:p>
+      <w:pPr>
+        <w:pStyle w:val="Normal"/>
+        <w:numPr>
+          <w:ilvl w:val="0"/>
+          <w:numId w:val="1"/>
+        </w:numPr>
+        <w:spacing w:lineRule="auto" w:line="319" w:before="0" w:after="160"/>
+        <w:rPr>
+          <w:rFonts w:eastAsia="Arial" w:cs="Arial"/>
+          <w:sz w:val="22"/>
+          <w:szCs w:val="22"/>
+        </w:rPr>
+      </w:pPr>
+      <w:r>
+        <w:rPr>
+          <w:rFonts w:eastAsia="Arial" w:cs="Arial"/>
+          <w:sz w:val="22"/>
+          <w:szCs w:val="22"/>
+        </w:rPr>
+        <w:t>Limitazioni: il test set contiene 213 campioni, di cui 18 Pathologic; per questa classe le metriche possono variare sensibilmente anche con poche predizioni diverse. I risultati vanno quindi letti come indicativi sul singolo split, in assenza di cross-validation.</w:t>
       </w:r>
     </w:p>
     <w:sectPr>
@@ -2568,6 +2437,273 @@
     </w:sectPr>
   </w:body>
 </w:document>
+</file>
+
+<file path=word/numbering.xml><?xml version="1.0" encoding="utf-8"?>
+<w:numbering xmlns:w="http://schemas.openxmlformats.org/wordprocessingml/2006/main" xmlns:o="urn:schemas-microsoft-com:office:office" xmlns:r="http://schemas.openxmlformats.org/officeDocument/2006/relationships" xmlns:v="urn:schemas-microsoft-com:vml" xmlns:mc="http://schemas.openxmlformats.org/markup-compatibility/2006" xmlns:w14="http://schemas.microsoft.com/office/word/2010/wordml" mc:Ignorable="w14">
+  <w:abstractNum w:abstractNumId="1">
+    <w:lvl w:ilvl="0">
+      <w:start w:val="1"/>
+      <w:numFmt w:val="bullet"/>
+      <w:lvlText w:val=""/>
+      <w:lvlJc w:val="start"/>
+      <w:pPr>
+        <w:tabs>
+          <w:tab w:val="num" w:pos="720"/>
+        </w:tabs>
+        <w:ind w:start="720" w:hanging="360"/>
+      </w:pPr>
+      <w:rPr>
+        <w:rFonts w:ascii="Symbol" w:hAnsi="Symbol" w:cs="Symbol" w:hint="default"/>
+      </w:rPr>
+    </w:lvl>
+    <w:lvl w:ilvl="1">
+      <w:start w:val="1"/>
+      <w:numFmt w:val="bullet"/>
+      <w:lvlText w:val="◦"/>
+      <w:lvlJc w:val="start"/>
+      <w:pPr>
+        <w:tabs>
+          <w:tab w:val="num" w:pos="1080"/>
+        </w:tabs>
+        <w:ind w:start="1080" w:hanging="360"/>
+      </w:pPr>
+      <w:rPr>
+        <w:rFonts w:ascii="OpenSymbol" w:hAnsi="OpenSymbol" w:cs="OpenSymbol" w:hint="default"/>
+      </w:rPr>
+    </w:lvl>
+    <w:lvl w:ilvl="2">
+      <w:start w:val="1"/>
+      <w:numFmt w:val="bullet"/>
+      <w:lvlText w:val="▪"/>
+      <w:lvlJc w:val="start"/>
+      <w:pPr>
+        <w:tabs>
+          <w:tab w:val="num" w:pos="1440"/>
+        </w:tabs>
+        <w:ind w:start="1440" w:hanging="360"/>
+      </w:pPr>
+      <w:rPr>
+        <w:rFonts w:ascii="OpenSymbol" w:hAnsi="OpenSymbol" w:cs="OpenSymbol" w:hint="default"/>
+      </w:rPr>
+    </w:lvl>
+    <w:lvl w:ilvl="3">
+      <w:start w:val="1"/>
+      <w:numFmt w:val="bullet"/>
+      <w:lvlText w:val=""/>
+      <w:lvlJc w:val="start"/>
+      <w:pPr>
+        <w:tabs>
+          <w:tab w:val="num" w:pos="1800"/>
+        </w:tabs>
+        <w:ind w:start="1800" w:hanging="360"/>
+      </w:pPr>
+      <w:rPr>
+        <w:rFonts w:ascii="Symbol" w:hAnsi="Symbol" w:cs="Symbol" w:hint="default"/>
+      </w:rPr>
+    </w:lvl>
+    <w:lvl w:ilvl="4">
+      <w:start w:val="1"/>
+      <w:numFmt w:val="bullet"/>
+      <w:lvlText w:val="◦"/>
+      <w:lvlJc w:val="start"/>
+      <w:pPr>
+        <w:tabs>
+          <w:tab w:val="num" w:pos="2160"/>
+        </w:tabs>
+        <w:ind w:start="2160" w:hanging="360"/>
+      </w:pPr>
+      <w:rPr>
+        <w:rFonts w:ascii="OpenSymbol" w:hAnsi="OpenSymbol" w:cs="OpenSymbol" w:hint="default"/>
+      </w:rPr>
+    </w:lvl>
+    <w:lvl w:ilvl="5">
+      <w:start w:val="1"/>
+      <w:numFmt w:val="bullet"/>
+      <w:lvlText w:val="▪"/>
+      <w:lvlJc w:val="start"/>
+      <w:pPr>
+        <w:tabs>
+          <w:tab w:val="num" w:pos="2520"/>
+        </w:tabs>
+        <w:ind w:start="2520" w:hanging="360"/>
+      </w:pPr>
+      <w:rPr>
+        <w:rFonts w:ascii="OpenSymbol" w:hAnsi="OpenSymbol" w:cs="OpenSymbol" w:hint="default"/>
+      </w:rPr>
+    </w:lvl>
+    <w:lvl w:ilvl="6">
+      <w:start w:val="1"/>
+      <w:numFmt w:val="bullet"/>
+      <w:lvlText w:val=""/>
+      <w:lvlJc w:val="start"/>
+      <w:pPr>
+        <w:tabs>
+          <w:tab w:val="num" w:pos="2880"/>
+        </w:tabs>
+        <w:ind w:start="2880" w:hanging="360"/>
+      </w:pPr>
+      <w:rPr>
+        <w:rFonts w:ascii="Symbol" w:hAnsi="Symbol" w:cs="Symbol" w:hint="default"/>
+      </w:rPr>
+    </w:lvl>
+    <w:lvl w:ilvl="7">
+      <w:start w:val="1"/>
+      <w:numFmt w:val="bullet"/>
+      <w:lvlText w:val="◦"/>
+      <w:lvlJc w:val="start"/>
+      <w:pPr>
+        <w:tabs>
+          <w:tab w:val="num" w:pos="3240"/>
+        </w:tabs>
+        <w:ind w:start="3240" w:hanging="360"/>
+      </w:pPr>
+      <w:rPr>
+        <w:rFonts w:ascii="OpenSymbol" w:hAnsi="OpenSymbol" w:cs="OpenSymbol" w:hint="default"/>
+      </w:rPr>
+    </w:lvl>
+    <w:lvl w:ilvl="8">
+      <w:start w:val="1"/>
+      <w:numFmt w:val="bullet"/>
+      <w:lvlText w:val="▪"/>
+      <w:lvlJc w:val="start"/>
+      <w:pPr>
+        <w:tabs>
+          <w:tab w:val="num" w:pos="3600"/>
+        </w:tabs>
+        <w:ind w:start="3600" w:hanging="360"/>
+      </w:pPr>
+      <w:rPr>
+        <w:rFonts w:ascii="OpenSymbol" w:hAnsi="OpenSymbol" w:cs="OpenSymbol" w:hint="default"/>
+      </w:rPr>
+    </w:lvl>
+  </w:abstractNum>
+  <w:abstractNum w:abstractNumId="2">
+    <w:lvl w:ilvl="0">
+      <w:start w:val="1"/>
+      <w:numFmt w:val="none"/>
+      <w:suff w:val="nothing"/>
+      <w:lvlText w:val=""/>
+      <w:lvlJc w:val="start"/>
+      <w:pPr>
+        <w:tabs>
+          <w:tab w:val="num" w:pos="0"/>
+        </w:tabs>
+        <w:ind w:start="0" w:hanging="0"/>
+      </w:pPr>
+    </w:lvl>
+    <w:lvl w:ilvl="1">
+      <w:start w:val="1"/>
+      <w:numFmt w:val="none"/>
+      <w:suff w:val="nothing"/>
+      <w:lvlText w:val=""/>
+      <w:lvlJc w:val="start"/>
+      <w:pPr>
+        <w:tabs>
+          <w:tab w:val="num" w:pos="0"/>
+        </w:tabs>
+        <w:ind w:start="0" w:hanging="0"/>
+      </w:pPr>
+    </w:lvl>
+    <w:lvl w:ilvl="2">
+      <w:start w:val="1"/>
+      <w:numFmt w:val="none"/>
+      <w:suff w:val="nothing"/>
+      <w:lvlText w:val=""/>
+      <w:lvlJc w:val="start"/>
+      <w:pPr>
+        <w:tabs>
+          <w:tab w:val="num" w:pos="0"/>
+        </w:tabs>
+        <w:ind w:start="0" w:hanging="0"/>
+      </w:pPr>
+    </w:lvl>
+    <w:lvl w:ilvl="3">
+      <w:start w:val="1"/>
+      <w:numFmt w:val="none"/>
+      <w:suff w:val="nothing"/>
+      <w:lvlText w:val=""/>
+      <w:lvlJc w:val="start"/>
+      <w:pPr>
+        <w:tabs>
+          <w:tab w:val="num" w:pos="0"/>
+        </w:tabs>
+        <w:ind w:start="0" w:hanging="0"/>
+      </w:pPr>
+    </w:lvl>
+    <w:lvl w:ilvl="4">
+      <w:start w:val="1"/>
+      <w:numFmt w:val="none"/>
+      <w:suff w:val="nothing"/>
+      <w:lvlText w:val=""/>
+      <w:lvlJc w:val="start"/>
+      <w:pPr>
+        <w:tabs>
+          <w:tab w:val="num" w:pos="0"/>
+        </w:tabs>
+        <w:ind w:start="0" w:hanging="0"/>
+      </w:pPr>
+    </w:lvl>
+    <w:lvl w:ilvl="5">
+      <w:start w:val="1"/>
+      <w:numFmt w:val="none"/>
+      <w:suff w:val="nothing"/>
+      <w:lvlText w:val=""/>
+      <w:lvlJc w:val="start"/>
+      <w:pPr>
+        <w:tabs>
+          <w:tab w:val="num" w:pos="0"/>
+        </w:tabs>
+        <w:ind w:start="0" w:hanging="0"/>
+      </w:pPr>
+    </w:lvl>
+    <w:lvl w:ilvl="6">
+      <w:start w:val="1"/>
+      <w:numFmt w:val="none"/>
+      <w:suff w:val="nothing"/>
+      <w:lvlText w:val=""/>
+      <w:lvlJc w:val="start"/>
+      <w:pPr>
+        <w:tabs>
+          <w:tab w:val="num" w:pos="0"/>
+        </w:tabs>
+        <w:ind w:start="0" w:hanging="0"/>
+      </w:pPr>
+    </w:lvl>
+    <w:lvl w:ilvl="7">
+      <w:start w:val="1"/>
+      <w:numFmt w:val="none"/>
+      <w:suff w:val="nothing"/>
+      <w:lvlText w:val=""/>
+      <w:lvlJc w:val="start"/>
+      <w:pPr>
+        <w:tabs>
+          <w:tab w:val="num" w:pos="0"/>
+        </w:tabs>
+        <w:ind w:start="0" w:hanging="0"/>
+      </w:pPr>
+    </w:lvl>
+    <w:lvl w:ilvl="8">
+      <w:start w:val="1"/>
+      <w:numFmt w:val="none"/>
+      <w:suff w:val="nothing"/>
+      <w:lvlText w:val=""/>
+      <w:lvlJc w:val="start"/>
+      <w:pPr>
+        <w:tabs>
+          <w:tab w:val="num" w:pos="0"/>
+        </w:tabs>
+        <w:ind w:start="0" w:hanging="0"/>
+      </w:pPr>
+    </w:lvl>
+  </w:abstractNum>
+  <w:num w:numId="1">
+    <w:abstractNumId w:val="1"/>
+  </w:num>
+  <w:num w:numId="2">
+    <w:abstractNumId w:val="2"/>
+  </w:num>
+</w:numbering>
 </file>
 
 <file path=word/styles.xml><?xml version="1.0" encoding="utf-8"?>
@@ -2757,6 +2893,13 @@
     <w:rPr>
       <w:sz w:val="20"/>
       <w:szCs w:val="20"/>
+    </w:rPr>
+  </w:style>
+  <w:style w:type="character" w:styleId="Bulletsuser">
+    <w:name w:val="Bullets (user)"/>
+    <w:qFormat/>
+    <w:rPr>
+      <w:rFonts w:ascii="OpenSymbol" w:hAnsi="OpenSymbol" w:eastAsia="OpenSymbol" w:cs="OpenSymbol"/>
     </w:rPr>
   </w:style>
   <w:style w:type="paragraph" w:styleId="Heading">

</xml_diff>